<commit_message>
Update report cover student and instructor
</commit_message>
<xml_diff>
--- a/лаба1/Отчет_лабораторная_1.docx
+++ b/лаба1/Отчет_лабораторная_1.docx
@@ -228,7 +228,7 @@
           </w:tcPr>
           <w:p>
             <w:r>
-              <w:t>Студент группы ______</w:t>
+              <w:t>Студент группы 4312</w:t>
             </w:r>
           </w:p>
         </w:tc>
@@ -257,7 +257,7 @@
           </w:tcPr>
           <w:p>
             <w:r>
-              <w:t>________________</w:t>
+              <w:t>Серов И.С.</w:t>
             </w:r>
           </w:p>
         </w:tc>
@@ -303,7 +303,7 @@
           </w:tcPr>
           <w:p>
             <w:r>
-              <w:t>________________</w:t>
+              <w:t>Тимофеев А.В.</w:t>
             </w:r>
           </w:p>
         </w:tc>

</xml_diff>